<commit_message>
Week 4 Saturday: a picture opens every part of the paper
Parts 1 to 5 now open on a small mechanism drawing beside their table: how
the guarantee pays, who sits in Thursday's review, the strip before and
after the switch, the order flow with the carousel's bypass, and Diwali's
three dates. Every label prints at 6.6 points or more.

Co-Authored-By: Claude Opus 5.5 <noreply@anthropic.com>
Claude-Session: https://claude.ai/code/session_01M3TYrKwqBYtaKqFgbeoeQn
</commit_message>
<xml_diff>
--- a/content/W04/SAT/paper/C2_W04_SAT_recap_paper_STUDENT.docx
+++ b/content/W04/SAT/paper/C2_W04_SAT_recap_paper_STUDENT.docx
@@ -4054,7 +4054,54 @@
                 <w:sz w:val="18"/>
                 <w:szCs w:val="18"/>
               </w:rPr>
-              <w:t xml:space="preserve">   Uber Hyderabad's peak-hour guarantee, the six weeks beginning 20 July 2026 against the six beginning 31 August 2026, the launch day.</w:t>
+              <w:t xml:space="preserve">   How the guarantee pays, and Uber Hyderabad's peak numbers, the six weeks beginning 20 July 2026 against the six beginning 31 August 2026, the launch day.</w:t>
+            </w:r>
+          </w:p>
+          <w:p>
+            <w:pPr>
+              <w:keepNext/>
+              <w:spacing w:after="80" w:before="80"/>
+              <w:jc w:val="center"/>
+            </w:pPr>
+            <w:r>
+              <w:drawing>
+                <wp:inline distT="0" distB="0" distL="0" distR="0">
+                  <wp:extent cx="5905500" cy="1914525"/>
+                  <wp:effectExtent t="0" r="0" b="0" l="0"/>
+                  <wp:docPr id="1" name="" descr="" title=""/>
+                  <wp:cNvGraphicFramePr>
+                    <a:graphicFrameLocks xmlns:a="http://schemas.openxmlformats.org/drawingml/2006/main" noChangeAspect="1"/>
+                  </wp:cNvGraphicFramePr>
+                  <a:graphic xmlns:a="http://schemas.openxmlformats.org/drawingml/2006/main">
+                    <a:graphicData uri="http://schemas.openxmlformats.org/drawingml/2006/picture">
+                      <pic:pic xmlns:pic="http://schemas.openxmlformats.org/drawingml/2006/picture">
+                        <pic:nvPicPr>
+                          <pic:cNvPr id="0" name="" descr=""/>
+                          <pic:cNvPicPr>
+                            <a:picLocks noChangeAspect="1" noChangeArrowheads="1"/>
+                          </pic:cNvPicPr>
+                        </pic:nvPicPr>
+                        <pic:blipFill>
+                          <a:blip r:embed="rId9" cstate="none"/>
+                          <a:srcRect/>
+                          <a:stretch>
+                            <a:fillRect/>
+                          </a:stretch>
+                        </pic:blipFill>
+                        <pic:spPr bwMode="auto">
+                          <a:xfrm>
+                            <a:off x="0" y="0"/>
+                            <a:ext cx="5905500" cy="1914525"/>
+                          </a:xfrm>
+                          <a:prstGeom prst="rect">
+                            <a:avLst/>
+                          </a:prstGeom>
+                        </pic:spPr>
+                      </pic:pic>
+                    </a:graphicData>
+                  </a:graphic>
+                </wp:inline>
+              </w:drawing>
             </w:r>
           </w:p>
           <w:tbl>
@@ -10990,7 +11037,54 @@
                 <w:sz w:val="18"/>
                 <w:szCs w:val="18"/>
               </w:rPr>
-              <w:t xml:space="preserve">   The same peak bookings read three ways, Uber Hyderabad, the six weeks before the launch and the six weeks after.</w:t>
+              <w:t xml:space="preserve">   Who sits in Thursday's review, and the same peak bookings read three ways, Uber Hyderabad, the six weeks before the launch and the six weeks after.</w:t>
+            </w:r>
+          </w:p>
+          <w:p>
+            <w:pPr>
+              <w:keepNext/>
+              <w:spacing w:after="80" w:before="80"/>
+              <w:jc w:val="center"/>
+            </w:pPr>
+            <w:r>
+              <w:drawing>
+                <wp:inline distT="0" distB="0" distL="0" distR="0">
+                  <wp:extent cx="3619500" cy="3533775"/>
+                  <wp:effectExtent t="0" r="0" b="0" l="0"/>
+                  <wp:docPr id="2" name="" descr="" title=""/>
+                  <wp:cNvGraphicFramePr>
+                    <a:graphicFrameLocks xmlns:a="http://schemas.openxmlformats.org/drawingml/2006/main" noChangeAspect="1"/>
+                  </wp:cNvGraphicFramePr>
+                  <a:graphic xmlns:a="http://schemas.openxmlformats.org/drawingml/2006/main">
+                    <a:graphicData uri="http://schemas.openxmlformats.org/drawingml/2006/picture">
+                      <pic:pic xmlns:pic="http://schemas.openxmlformats.org/drawingml/2006/picture">
+                        <pic:nvPicPr>
+                          <pic:cNvPr id="0" name="" descr=""/>
+                          <pic:cNvPicPr>
+                            <a:picLocks noChangeAspect="1" noChangeArrowheads="1"/>
+                          </pic:cNvPicPr>
+                        </pic:nvPicPr>
+                        <pic:blipFill>
+                          <a:blip r:embed="rId10" cstate="none"/>
+                          <a:srcRect/>
+                          <a:stretch>
+                            <a:fillRect/>
+                          </a:stretch>
+                        </pic:blipFill>
+                        <pic:spPr bwMode="auto">
+                          <a:xfrm>
+                            <a:off x="0" y="0"/>
+                            <a:ext cx="3619500" cy="3533775"/>
+                          </a:xfrm>
+                          <a:prstGeom prst="rect">
+                            <a:avLst/>
+                          </a:prstGeom>
+                        </pic:spPr>
+                      </pic:pic>
+                    </a:graphicData>
+                  </a:graphic>
+                </wp:inline>
+              </w:drawing>
             </w:r>
           </w:p>
           <w:tbl>
@@ -13710,7 +13804,54 @@
                 <w:sz w:val="18"/>
                 <w:szCs w:val="18"/>
               </w:rPr>
-              <w:t xml:space="preserve">   Swiggy Instamart, Pune: the ticket's headline numbers.</w:t>
+              <w:t xml:space="preserve">   Swiggy Instamart, Pune: the strip before and after the switch, and the ticket's headline numbers.</w:t>
+            </w:r>
+          </w:p>
+          <w:p>
+            <w:pPr>
+              <w:keepNext/>
+              <w:spacing w:after="80" w:before="80"/>
+              <w:jc w:val="center"/>
+            </w:pPr>
+            <w:r>
+              <w:drawing>
+                <wp:inline distT="0" distB="0" distL="0" distR="0">
+                  <wp:extent cx="5257800" cy="2324100"/>
+                  <wp:effectExtent t="0" r="0" b="0" l="0"/>
+                  <wp:docPr id="3" name="" descr="" title=""/>
+                  <wp:cNvGraphicFramePr>
+                    <a:graphicFrameLocks xmlns:a="http://schemas.openxmlformats.org/drawingml/2006/main" noChangeAspect="1"/>
+                  </wp:cNvGraphicFramePr>
+                  <a:graphic xmlns:a="http://schemas.openxmlformats.org/drawingml/2006/main">
+                    <a:graphicData uri="http://schemas.openxmlformats.org/drawingml/2006/picture">
+                      <pic:pic xmlns:pic="http://schemas.openxmlformats.org/drawingml/2006/picture">
+                        <pic:nvPicPr>
+                          <pic:cNvPr id="0" name="" descr=""/>
+                          <pic:cNvPicPr>
+                            <a:picLocks noChangeAspect="1" noChangeArrowheads="1"/>
+                          </pic:cNvPicPr>
+                        </pic:nvPicPr>
+                        <pic:blipFill>
+                          <a:blip r:embed="rId11" cstate="none"/>
+                          <a:srcRect/>
+                          <a:stretch>
+                            <a:fillRect/>
+                          </a:stretch>
+                        </pic:blipFill>
+                        <pic:spPr bwMode="auto">
+                          <a:xfrm>
+                            <a:off x="0" y="0"/>
+                            <a:ext cx="5257800" cy="2324100"/>
+                          </a:xfrm>
+                          <a:prstGeom prst="rect">
+                            <a:avLst/>
+                          </a:prstGeom>
+                        </pic:spPr>
+                      </pic:pic>
+                    </a:graphicData>
+                  </a:graphic>
+                </wp:inline>
+              </w:drawing>
             </w:r>
           </w:p>
           <w:tbl>
@@ -18264,7 +18405,54 @@
                 <w:sz w:val="18"/>
                 <w:szCs w:val="18"/>
               </w:rPr>
-              <w:t xml:space="preserve">   Zomato Gold, Chennai: members by signup month in 2026, and the share who ordered in month one, the calendar month after signup. 53,089 members joined from January to September.</w:t>
+              <w:t xml:space="preserve">   Zomato Gold, Chennai: the order flow a member walks through, where the lower path from Open is the home carousel, which opens a menu without a search, and members by signup month in 2026 with the share who ordered in month one, the calendar month after signup. 53,089 members joined from January to September.</w:t>
+            </w:r>
+          </w:p>
+          <w:p>
+            <w:pPr>
+              <w:keepNext/>
+              <w:spacing w:after="80" w:before="80"/>
+              <w:jc w:val="center"/>
+            </w:pPr>
+            <w:r>
+              <w:drawing>
+                <wp:inline distT="0" distB="0" distL="0" distR="0">
+                  <wp:extent cx="5905500" cy="409575"/>
+                  <wp:effectExtent t="0" r="0" b="0" l="0"/>
+                  <wp:docPr id="4" name="" descr="" title=""/>
+                  <wp:cNvGraphicFramePr>
+                    <a:graphicFrameLocks xmlns:a="http://schemas.openxmlformats.org/drawingml/2006/main" noChangeAspect="1"/>
+                  </wp:cNvGraphicFramePr>
+                  <a:graphic xmlns:a="http://schemas.openxmlformats.org/drawingml/2006/main">
+                    <a:graphicData uri="http://schemas.openxmlformats.org/drawingml/2006/picture">
+                      <pic:pic xmlns:pic="http://schemas.openxmlformats.org/drawingml/2006/picture">
+                        <pic:nvPicPr>
+                          <pic:cNvPr id="0" name="" descr=""/>
+                          <pic:cNvPicPr>
+                            <a:picLocks noChangeAspect="1" noChangeArrowheads="1"/>
+                          </pic:cNvPicPr>
+                        </pic:nvPicPr>
+                        <pic:blipFill>
+                          <a:blip r:embed="rId12" cstate="none"/>
+                          <a:srcRect/>
+                          <a:stretch>
+                            <a:fillRect/>
+                          </a:stretch>
+                        </pic:blipFill>
+                        <pic:spPr bwMode="auto">
+                          <a:xfrm>
+                            <a:off x="0" y="0"/>
+                            <a:ext cx="5905500" cy="409575"/>
+                          </a:xfrm>
+                          <a:prstGeom prst="rect">
+                            <a:avLst/>
+                          </a:prstGeom>
+                        </pic:spPr>
+                      </pic:pic>
+                    </a:graphicData>
+                  </a:graphic>
+                </wp:inline>
+              </w:drawing>
             </w:r>
           </w:p>
           <w:tbl>
@@ -24244,6 +24432,53 @@
               <w:t xml:space="preserve">   Diwali in the Government of India's holiday lists for 2024, 2025 and 2026 (DoPT, as reproduced by staffnews.in, checked 13 October 2026).</w:t>
             </w:r>
           </w:p>
+          <w:p>
+            <w:pPr>
+              <w:keepNext/>
+              <w:spacing w:after="80" w:before="80"/>
+              <w:jc w:val="center"/>
+            </w:pPr>
+            <w:r>
+              <w:drawing>
+                <wp:inline distT="0" distB="0" distL="0" distR="0">
+                  <wp:extent cx="5257800" cy="1047750"/>
+                  <wp:effectExtent t="0" r="0" b="0" l="0"/>
+                  <wp:docPr id="5" name="" descr="" title=""/>
+                  <wp:cNvGraphicFramePr>
+                    <a:graphicFrameLocks xmlns:a="http://schemas.openxmlformats.org/drawingml/2006/main" noChangeAspect="1"/>
+                  </wp:cNvGraphicFramePr>
+                  <a:graphic xmlns:a="http://schemas.openxmlformats.org/drawingml/2006/main">
+                    <a:graphicData uri="http://schemas.openxmlformats.org/drawingml/2006/picture">
+                      <pic:pic xmlns:pic="http://schemas.openxmlformats.org/drawingml/2006/picture">
+                        <pic:nvPicPr>
+                          <pic:cNvPr id="0" name="" descr=""/>
+                          <pic:cNvPicPr>
+                            <a:picLocks noChangeAspect="1" noChangeArrowheads="1"/>
+                          </pic:cNvPicPr>
+                        </pic:nvPicPr>
+                        <pic:blipFill>
+                          <a:blip r:embed="rId13" cstate="none"/>
+                          <a:srcRect/>
+                          <a:stretch>
+                            <a:fillRect/>
+                          </a:stretch>
+                        </pic:blipFill>
+                        <pic:spPr bwMode="auto">
+                          <a:xfrm>
+                            <a:off x="0" y="0"/>
+                            <a:ext cx="5257800" cy="1047750"/>
+                          </a:xfrm>
+                          <a:prstGeom prst="rect">
+                            <a:avLst/>
+                          </a:prstGeom>
+                        </pic:spPr>
+                      </pic:pic>
+                    </a:graphicData>
+                  </a:graphic>
+                </wp:inline>
+              </w:drawing>
+            </w:r>
+          </w:p>
           <w:tbl>
             <w:tblPr>
               <w:tblW w:type="dxa" w:w="8580"/>
@@ -28499,7 +28734,7 @@
                 <wp:inline distT="0" distB="0" distL="0" distR="0">
                   <wp:extent cx="5905500" cy="2638425"/>
                   <wp:effectExtent t="0" r="0" b="0" l="0"/>
-                  <wp:docPr id="1" name="" descr="" title=""/>
+                  <wp:docPr id="6" name="" descr="" title=""/>
                   <wp:cNvGraphicFramePr>
                     <a:graphicFrameLocks xmlns:a="http://schemas.openxmlformats.org/drawingml/2006/main" noChangeAspect="1"/>
                   </wp:cNvGraphicFramePr>
@@ -28513,7 +28748,7 @@
                           </pic:cNvPicPr>
                         </pic:nvPicPr>
                         <pic:blipFill>
-                          <a:blip r:embed="rId9" cstate="none"/>
+                          <a:blip r:embed="rId14" cstate="none"/>
                           <a:srcRect/>
                           <a:stretch>
                             <a:fillRect/>

</xml_diff>